<commit_message>
Reissue the feature catalogue with Lock-in Accounts under renewals
208 menu entries, each under one function.
</commit_message>
<xml_diff>
--- a/docs/TISPH/proposals/TISPH_Feature_Catalogue_and_Release_Tiers.docx
+++ b/docs/TISPH/proposals/TISPH_Feature_Catalogue_and_Release_Tiers.docx
@@ -3723,7 +3723,7 @@
                 <w:sz w:val="16"/>
                 <w:szCs w:val="16"/>
               </w:rPr>
-              <w:t xml:space="preserve">135</w:t>
+              <w:t xml:space="preserve">136</w:t>
             </w:r>
           </w:p>
         </w:tc>
@@ -4087,7 +4087,7 @@
                 <w:sz w:val="16"/>
                 <w:szCs w:val="16"/>
               </w:rPr>
-              <w:t xml:space="preserve">207</w:t>
+              <w:t xml:space="preserve">208</w:t>
             </w:r>
           </w:p>
         </w:tc>
@@ -5599,7 +5599,7 @@
                 <w:sz w:val="16"/>
                 <w:szCs w:val="16"/>
               </w:rPr>
-              <w:t xml:space="preserve">Renewal run, notices at 90, 60 and 30 days, renewal queue, negotiations and lapse management</w:t>
+              <w:t xml:space="preserve">Renewal run, notices at 90, 60 and 30 days, renewal queue, negotiations, lapse management and lock-in accounts</w:t>
             </w:r>
           </w:p>
         </w:tc>
@@ -5617,7 +5617,7 @@
                 <w:sz w:val="16"/>
                 <w:szCs w:val="16"/>
               </w:rPr>
-              <w:t xml:space="preserve">TIS-BRD-RENEW-01, TIS-BRD-RENEW-02, TIS-BRD-RENEW-03, TIS-BRD-RENEW-05, PBSM-M24-LAP, PBSM-M15-REN-DUE</w:t>
+              <w:t xml:space="preserve">TIS-BRD-RENEW-01, TIS-BRD-RENEW-02, TIS-BRD-RENEW-03, TIS-BRD-RENEW-05, TIS-BRD-SCHM-03, PBSM-M24-LAP, PBSM-M15-REN-DUE</w:t>
             </w:r>
           </w:p>
         </w:tc>

</xml_diff>

<commit_message>
Reissue the feature catalogue with the post-dated cheque and receipt screens
80 functions, 214 menu entries.
</commit_message>
<xml_diff>
--- a/docs/TISPH/proposals/TISPH_Feature_Catalogue_and_Release_Tiers.docx
+++ b/docs/TISPH/proposals/TISPH_Feature_Catalogue_and_Release_Tiers.docx
@@ -3723,7 +3723,7 @@
                 <w:sz w:val="16"/>
                 <w:szCs w:val="16"/>
               </w:rPr>
-              <w:t xml:space="preserve">139</w:t>
+              <w:t xml:space="preserve">142</w:t>
             </w:r>
           </w:p>
         </w:tc>
@@ -4087,7 +4087,7 @@
                 <w:sz w:val="16"/>
                 <w:szCs w:val="16"/>
               </w:rPr>
-              <w:t xml:space="preserve">211</w:t>
+              <w:t xml:space="preserve">214</w:t>
             </w:r>
           </w:p>
         </w:tc>
@@ -5843,7 +5843,7 @@
                 <w:sz w:val="16"/>
                 <w:szCs w:val="16"/>
               </w:rPr>
-              <w:t xml:space="preserve">TIS-BRD-COLL-01, TIS-BRD-COLL-03, TIS-BRD-COLL-04, TIS-BRD-COLL-05, TIS-BRD-COLL-06, TIS-BRD-COLL-07, TIS-BRD-COLL-08, PBSM-M17v4-RECEIPTING, PBSM-M17v4-PDC</w:t>
+              <w:t xml:space="preserve">TIS-BRD-COLL-01, TIS-BRD-COLL-03, TIS-BRD-COLL-04, TIS-BRD-COLL-05, TIS-BRD-COLL-06, TIS-BRD-COLL-07, TIS-BRD-COLL-08, PBSM-M17v4-RECEIPTING, PBSM-M17v4-PDC, TIS-BRD-RPT-CCD-01, TIS-BRD-RPT-CCD-02, TIS-BRD-RPT-CCD-03, TIS-BRD-RPT-CCD-04, TIS-BRD-RPT-CCD-05, TIS-BRD-RPT-CCD-06, TIS-BRD-RPT-CCD-07, FR-PDC-001, FGA-BR-02, MOM-S3-COLL-RV-SPLIT, PBSM-M15-COL-SLA</w:t>
             </w:r>
           </w:p>
         </w:tc>
@@ -6408,7 +6408,7 @@
                 <w:sz w:val="16"/>
                 <w:szCs w:val="16"/>
               </w:rPr>
-              <w:t xml:space="preserve">TIS-BRD-COMM-01, TIS-BRD-COMM-03, TIS-BRD-COMM-04, TIS-BRD-RPT-OPS-05, TIS-BRD-RPT-OPS-06, TIS-BRD-RPT-OPS-08, TIS-BRD-RPT-OPS-09, PBSM-M15-REMIT-WEEKLY, FR-RMT-001</w:t>
+              <w:t xml:space="preserve">TIS-BRD-COMM-01, TIS-BRD-COMM-03, TIS-BRD-COMM-04, TIS-BRD-RPT-OPS-05, TIS-BRD-RPT-OPS-06, TIS-BRD-RPT-OPS-08, TIS-BRD-RPT-OPS-09, PBSM-M15-REMIT-WEEKLY, FR-RMT-001, FR-RMT-011, FR-RMT-012, FR-RMT-020, PBSM-M15-BILL-RUN</w:t>
             </w:r>
           </w:p>
         </w:tc>
@@ -7651,7 +7651,7 @@
                 <w:sz w:val="16"/>
                 <w:szCs w:val="16"/>
               </w:rPr>
-              <w:t xml:space="preserve">TIS-BRD-GL-01, TIS-BRD-GL-02, TIS-BRD-TAX-01, TIS-BRD-PROD-11, TIS-BRD-PROD-16, FGA-DS-04, MOM-S9-ACC-COST-CENTRE, PBSM-M18-COA, PBSM-M23-POSTING</w:t>
+              <w:t xml:space="preserve">TIS-BRD-GL-01, TIS-BRD-GL-02, TIS-BRD-TAX-01, TIS-BRD-PROD-11, TIS-BRD-PROD-16, FGA-DS-04, MOM-S9-ACC-COST-CENTRE, PBSM-M18-COA, PBSM-M23-POSTING, FGA-DS-07</w:t>
             </w:r>
           </w:p>
         </w:tc>

</xml_diff>

<commit_message>
Reissue the feature catalogue with the commission rules and sharing schemes
80 functions, 215 menu entries.
</commit_message>
<xml_diff>
--- a/docs/TISPH/proposals/TISPH_Feature_Catalogue_and_Release_Tiers.docx
+++ b/docs/TISPH/proposals/TISPH_Feature_Catalogue_and_Release_Tiers.docx
@@ -992,7 +992,7 @@
             <w:b/>
             <w:noProof/>
           </w:rPr>
-          <w:t>9</w:t>
+          <w:t>10</w:t>
         </w:r>
       </w:hyperlink>
     </w:p>
@@ -1034,7 +1034,7 @@
             <w:b/>
             <w:noProof/>
           </w:rPr>
-          <w:t>10</w:t>
+          <w:t>11</w:t>
         </w:r>
       </w:hyperlink>
     </w:p>
@@ -1076,7 +1076,7 @@
             <w:b/>
             <w:noProof/>
           </w:rPr>
-          <w:t>11</w:t>
+          <w:t>12</w:t>
         </w:r>
       </w:hyperlink>
     </w:p>
@@ -3723,7 +3723,7 @@
                 <w:sz w:val="16"/>
                 <w:szCs w:val="16"/>
               </w:rPr>
-              <w:t xml:space="preserve">142</w:t>
+              <w:t xml:space="preserve">143</w:t>
             </w:r>
           </w:p>
         </w:tc>
@@ -4087,7 +4087,7 @@
                 <w:sz w:val="16"/>
                 <w:szCs w:val="16"/>
               </w:rPr>
-              <w:t xml:space="preserve">214</w:t>
+              <w:t xml:space="preserve">215</w:t>
             </w:r>
           </w:p>
         </w:tc>
@@ -7068,7 +7068,7 @@
                 <w:sz w:val="16"/>
                 <w:szCs w:val="16"/>
               </w:rPr>
-              <w:t xml:space="preserve">Commission dashboard and the accounts of agents, dealers and referrers with their share</w:t>
+              <w:t xml:space="preserve">Commission dashboard, the accounts of agents, dealers and referrers with their share, the sharing schemes, the commission basis of a policy and the change requests on commission lines</w:t>
             </w:r>
           </w:p>
         </w:tc>
@@ -7086,7 +7086,7 @@
                 <w:sz w:val="16"/>
                 <w:szCs w:val="16"/>
               </w:rPr>
-              <w:t xml:space="preserve">TIS-BRD-COMM-05, TIS-BRD-COMM-06, TIS-BRD-PROD-16, TIS-BRD-RPT-OPS-07</w:t>
+              <w:t xml:space="preserve">TIS-BRD-COMM-02, TIS-BRD-COMM-05, TIS-BRD-COMM-06, TIS-BRD-PROD-16, TIS-BRD-RPT-OPS-07, FR-CMR-010, FR-CMR-015, FR-CMR-022, FR-RMT-001, FR-RMT-003, FR-RMT-005, FR-RMT-030</w:t>
             </w:r>
           </w:p>
         </w:tc>

</xml_diff>

<commit_message>
Reissue the feature catalogue with the Talkbot renewal calls
81 functions, 220 menu entries.
</commit_message>
<xml_diff>
--- a/docs/TISPH/proposals/TISPH_Feature_Catalogue_and_Release_Tiers.docx
+++ b/docs/TISPH/proposals/TISPH_Feature_Catalogue_and_Release_Tiers.docx
@@ -3705,7 +3705,7 @@
                 <w:sz w:val="16"/>
                 <w:szCs w:val="16"/>
               </w:rPr>
-              <w:t xml:space="preserve">30</w:t>
+              <w:t xml:space="preserve">31</w:t>
             </w:r>
           </w:p>
         </w:tc>
@@ -3723,7 +3723,7 @@
                 <w:sz w:val="16"/>
                 <w:szCs w:val="16"/>
               </w:rPr>
-              <w:t xml:space="preserve">143</w:t>
+              <w:t xml:space="preserve">148</w:t>
             </w:r>
           </w:p>
         </w:tc>
@@ -4069,7 +4069,7 @@
                 <w:sz w:val="16"/>
                 <w:szCs w:val="16"/>
               </w:rPr>
-              <w:t xml:space="preserve">80</w:t>
+              <w:t xml:space="preserve">81</w:t>
             </w:r>
           </w:p>
         </w:tc>
@@ -4087,7 +4087,7 @@
                 <w:sz w:val="16"/>
                 <w:szCs w:val="16"/>
               </w:rPr>
-              <w:t xml:space="preserve">215</w:t>
+              <w:t xml:space="preserve">220</w:t>
             </w:r>
           </w:p>
         </w:tc>
@@ -5789,7 +5789,7 @@
                 <w:sz w:val="16"/>
                 <w:szCs w:val="16"/>
               </w:rPr>
-              <w:t xml:space="preserve">Receipts and post-dated cheques</w:t>
+              <w:t xml:space="preserve">Talkbot renewal calls</w:t>
             </w:r>
           </w:p>
         </w:tc>
@@ -5807,7 +5807,7 @@
                 <w:sz w:val="16"/>
                 <w:szCs w:val="16"/>
               </w:rPr>
-              <w:t xml:space="preserve">Accounts</w:t>
+              <w:t xml:space="preserve">Operations</w:t>
             </w:r>
           </w:p>
         </w:tc>
@@ -5825,7 +5825,7 @@
                 <w:sz w:val="16"/>
                 <w:szCs w:val="16"/>
               </w:rPr>
-              <w:t xml:space="preserve">Official and acknowledgement receipts, allocation and matching, post-dated cheques and their deposit</w:t>
+              <w:t xml:space="preserve">Talkbot call lists of the Motor renewals, the call results upload, the Talkbot outcome and the Talkbot filter on renewal quotes</w:t>
             </w:r>
           </w:p>
         </w:tc>
@@ -5843,7 +5843,7 @@
                 <w:sz w:val="16"/>
                 <w:szCs w:val="16"/>
               </w:rPr>
-              <w:t xml:space="preserve">TIS-BRD-COLL-01, TIS-BRD-COLL-03, TIS-BRD-COLL-04, TIS-BRD-COLL-05, TIS-BRD-COLL-06, TIS-BRD-COLL-07, TIS-BRD-COLL-08, PBSM-M17v4-RECEIPTING, PBSM-M17v4-PDC, TIS-BRD-RPT-CCD-01, TIS-BRD-RPT-CCD-02, TIS-BRD-RPT-CCD-03, TIS-BRD-RPT-CCD-04, TIS-BRD-RPT-CCD-05, TIS-BRD-RPT-CCD-06, TIS-BRD-RPT-CCD-07, FR-PDC-001, FGA-BR-02, MOM-S3-COLL-RV-SPLIT, PBSM-M15-COL-SLA</w:t>
+              <w:t xml:space="preserve">TIS-BRD-LEAD-09, CR-02</w:t>
             </w:r>
           </w:p>
         </w:tc>
@@ -5861,7 +5861,7 @@
                 <w:sz w:val="16"/>
                 <w:szCs w:val="16"/>
               </w:rPr>
-              <w:t xml:space="preserve">-</w:t>
+              <w:t xml:space="preserve">Renewals</w:t>
             </w:r>
           </w:p>
         </w:tc>
@@ -5902,7 +5902,7 @@
                 <w:sz w:val="16"/>
                 <w:szCs w:val="16"/>
               </w:rPr>
-              <w:t xml:space="preserve">Collections and credit control</w:t>
+              <w:t xml:space="preserve">Receipts and post-dated cheques</w:t>
             </w:r>
           </w:p>
         </w:tc>
@@ -5938,7 +5938,7 @@
                 <w:sz w:val="16"/>
                 <w:szCs w:val="16"/>
               </w:rPr>
-              <w:t xml:space="preserve">Collections, instalment plans, premium warranty monitor and remittance ageing</w:t>
+              <w:t xml:space="preserve">Official and acknowledgement receipts, allocation and matching, post-dated cheques and their deposit</w:t>
             </w:r>
           </w:p>
         </w:tc>
@@ -5956,7 +5956,7 @@
                 <w:sz w:val="16"/>
                 <w:szCs w:val="16"/>
               </w:rPr>
-              <w:t xml:space="preserve">TIS-BRD-PROD-17, TIS-BRD-RPT-OPS-10, TIS-BRD-RPT-OPS-11, TIS-BRD-COMM-04, MOM-S3-COLL-CREDIT-TERMS</w:t>
+              <w:t xml:space="preserve">TIS-BRD-COLL-01, TIS-BRD-COLL-03, TIS-BRD-COLL-04, TIS-BRD-COLL-05, TIS-BRD-COLL-06, TIS-BRD-COLL-07, TIS-BRD-COLL-08, PBSM-M17v4-RECEIPTING, PBSM-M17v4-PDC, TIS-BRD-RPT-CCD-01, TIS-BRD-RPT-CCD-02, TIS-BRD-RPT-CCD-03, TIS-BRD-RPT-CCD-04, TIS-BRD-RPT-CCD-05, TIS-BRD-RPT-CCD-06, TIS-BRD-RPT-CCD-07, FR-PDC-001, FGA-BR-02, MOM-S3-COLL-RV-SPLIT, PBSM-M15-COL-SLA</w:t>
             </w:r>
           </w:p>
         </w:tc>
@@ -6015,7 +6015,7 @@
                 <w:sz w:val="16"/>
                 <w:szCs w:val="16"/>
               </w:rPr>
-              <w:t xml:space="preserve">Suppliers and supplier BIR 2307</w:t>
+              <w:t xml:space="preserve">Collections and credit control</w:t>
             </w:r>
           </w:p>
         </w:tc>
@@ -6051,7 +6051,7 @@
                 <w:sz w:val="16"/>
                 <w:szCs w:val="16"/>
               </w:rPr>
-              <w:t xml:space="preserve">Vendor and payee register for non-insurer payments, and the BIR Form 2307 issued to suppliers</w:t>
+              <w:t xml:space="preserve">Collections, instalment plans, premium warranty monitor and remittance ageing</w:t>
             </w:r>
           </w:p>
         </w:tc>
@@ -6069,7 +6069,7 @@
                 <w:sz w:val="16"/>
                 <w:szCs w:val="16"/>
               </w:rPr>
-              <w:t xml:space="preserve">TIS-BRD-MAS-06, FGA-EN-01, TIS-BRD-TAX-03</w:t>
+              <w:t xml:space="preserve">TIS-BRD-PROD-17, TIS-BRD-RPT-OPS-10, TIS-BRD-RPT-OPS-11, TIS-BRD-COMM-04, MOM-S3-COLL-CREDIT-TERMS</w:t>
             </w:r>
           </w:p>
         </w:tc>
@@ -6128,7 +6128,7 @@
                 <w:sz w:val="16"/>
                 <w:szCs w:val="16"/>
               </w:rPr>
-              <w:t xml:space="preserve">Disbursements and bank payment files</w:t>
+              <w:t xml:space="preserve">Suppliers and supplier BIR 2307</w:t>
             </w:r>
           </w:p>
         </w:tc>
@@ -6164,7 +6164,7 @@
                 <w:sz w:val="16"/>
                 <w:szCs w:val="16"/>
               </w:rPr>
-              <w:t xml:space="preserve">Payment vouchers and cheques, refund fund transfers and Metrobank payment files with maker-checker</w:t>
+              <w:t xml:space="preserve">Vendor and payee register for non-insurer payments, and the BIR Form 2307 issued to suppliers</w:t>
             </w:r>
           </w:p>
         </w:tc>
@@ -6182,7 +6182,7 @@
                 <w:sz w:val="16"/>
                 <w:szCs w:val="16"/>
               </w:rPr>
-              <w:t xml:space="preserve">TIS-BRD-DISB-01, TIS-BRD-DISB-02, TIS-BRD-DISB-03, PBSM-M17v4-DISB, MOM-S5-DISB-MAKER-CHECKER</w:t>
+              <w:t xml:space="preserve">TIS-BRD-MAS-06, FGA-EN-01, TIS-BRD-TAX-03</w:t>
             </w:r>
           </w:p>
         </w:tc>
@@ -6241,7 +6241,7 @@
                 <w:sz w:val="16"/>
                 <w:szCs w:val="16"/>
               </w:rPr>
-              <w:t xml:space="preserve">Bank file interface</w:t>
+              <w:t xml:space="preserve">Disbursements and bank payment files</w:t>
             </w:r>
           </w:p>
         </w:tc>
@@ -6277,7 +6277,7 @@
                 <w:sz w:val="16"/>
                 <w:szCs w:val="16"/>
               </w:rPr>
-              <w:t xml:space="preserve">Connector and outbox of the bank payment files</w:t>
+              <w:t xml:space="preserve">Payment vouchers and cheques, refund fund transfers and Metrobank payment files with maker-checker</w:t>
             </w:r>
           </w:p>
         </w:tc>
@@ -6295,7 +6295,7 @@
                 <w:sz w:val="16"/>
                 <w:szCs w:val="16"/>
               </w:rPr>
-              <w:t xml:space="preserve">TIS-BRD-DISB-03, TIS-BRD-NFR-09</w:t>
+              <w:t xml:space="preserve">TIS-BRD-DISB-01, TIS-BRD-DISB-02, TIS-BRD-DISB-03, PBSM-M17v4-DISB, MOM-S5-DISB-MAKER-CHECKER</w:t>
             </w:r>
           </w:p>
         </w:tc>
@@ -6354,7 +6354,7 @@
                 <w:sz w:val="16"/>
                 <w:szCs w:val="16"/>
               </w:rPr>
-              <w:t xml:space="preserve">Remittance to insurers</w:t>
+              <w:t xml:space="preserve">Bank file interface</w:t>
             </w:r>
           </w:p>
         </w:tc>
@@ -6390,7 +6390,7 @@
                 <w:sz w:val="16"/>
                 <w:szCs w:val="16"/>
               </w:rPr>
-              <w:t xml:space="preserve">Weekly remittance with approvals, insurer payments, statement reconciliation, exceptions, billing, schedules and settlement</w:t>
+              <w:t xml:space="preserve">Connector and outbox of the bank payment files</w:t>
             </w:r>
           </w:p>
         </w:tc>
@@ -6408,7 +6408,7 @@
                 <w:sz w:val="16"/>
                 <w:szCs w:val="16"/>
               </w:rPr>
-              <w:t xml:space="preserve">TIS-BRD-COMM-01, TIS-BRD-COMM-03, TIS-BRD-COMM-04, TIS-BRD-RPT-OPS-05, TIS-BRD-RPT-OPS-06, TIS-BRD-RPT-OPS-08, TIS-BRD-RPT-OPS-09, PBSM-M15-REMIT-WEEKLY, FR-RMT-001, FR-RMT-011, FR-RMT-012, FR-RMT-020, PBSM-M15-BILL-RUN</w:t>
+              <w:t xml:space="preserve">TIS-BRD-DISB-03, TIS-BRD-NFR-09</w:t>
             </w:r>
           </w:p>
         </w:tc>
@@ -6467,7 +6467,7 @@
                 <w:sz w:val="16"/>
                 <w:szCs w:val="16"/>
               </w:rPr>
-              <w:t xml:space="preserve">Journals and general ledger</w:t>
+              <w:t xml:space="preserve">Remittance to insurers</w:t>
             </w:r>
           </w:p>
         </w:tc>
@@ -6503,7 +6503,7 @@
                 <w:sz w:val="16"/>
                 <w:szCs w:val="16"/>
               </w:rPr>
-              <w:t xml:space="preserve">Journal vouchers with upload, correction and reversal, open entry matching, accounting queries and the daily SAP GL files</w:t>
+              <w:t xml:space="preserve">Weekly remittance with approvals, insurer payments, statement reconciliation, exceptions, billing, schedules and settlement</w:t>
             </w:r>
           </w:p>
         </w:tc>
@@ -6521,7 +6521,7 @@
                 <w:sz w:val="16"/>
                 <w:szCs w:val="16"/>
               </w:rPr>
-              <w:t xml:space="preserve">TIS-BRD-NIA-05, TIS-BRD-GL-01, TIS-BRD-GL-02, TIS-BRD-GL-03, TIS-BRD-GL-06, TIS-BRD-INTG-04, FGA-JV-01, MOM-S5-AP-JV-UPLOAD, PBSM-M17v4-JV, PBSM-M17v4-REVERSALS</w:t>
+              <w:t xml:space="preserve">TIS-BRD-COMM-01, TIS-BRD-COMM-03, TIS-BRD-COMM-04, TIS-BRD-RPT-OPS-05, TIS-BRD-RPT-OPS-06, TIS-BRD-RPT-OPS-08, TIS-BRD-RPT-OPS-09, PBSM-M15-REMIT-WEEKLY, FR-RMT-001, FR-RMT-011, FR-RMT-012, FR-RMT-020, PBSM-M15-BILL-RUN</w:t>
             </w:r>
           </w:p>
         </w:tc>
@@ -6580,7 +6580,7 @@
                 <w:sz w:val="16"/>
                 <w:szCs w:val="16"/>
               </w:rPr>
-              <w:t xml:space="preserve">Bank reconciliation</w:t>
+              <w:t xml:space="preserve">Journals and general ledger</w:t>
             </w:r>
           </w:p>
         </w:tc>
@@ -6616,7 +6616,7 @@
                 <w:sz w:val="16"/>
                 <w:szCs w:val="16"/>
               </w:rPr>
-              <w:t xml:space="preserve">Bank statement upload and matching, reconciliations with approval, and the bank reconciliation reports</w:t>
+              <w:t xml:space="preserve">Journal vouchers with upload, correction and reversal, open entry matching, accounting queries and the daily SAP GL files</w:t>
             </w:r>
           </w:p>
         </w:tc>
@@ -6634,7 +6634,7 @@
                 <w:sz w:val="16"/>
                 <w:szCs w:val="16"/>
               </w:rPr>
-              <w:t xml:space="preserve">TIS-BRD-COLL-09, TIS-BRD-RPT-OPS-12, TIS-BRD-RPT-OPS-13, PBSM-M17v4-RECON</w:t>
+              <w:t xml:space="preserve">TIS-BRD-NIA-05, TIS-BRD-GL-01, TIS-BRD-GL-02, TIS-BRD-GL-03, TIS-BRD-GL-06, TIS-BRD-INTG-04, FGA-JV-01, MOM-S5-AP-JV-UPLOAD, PBSM-M17v4-JV, PBSM-M17v4-REVERSALS</w:t>
             </w:r>
           </w:p>
         </w:tc>
@@ -6693,7 +6693,7 @@
                 <w:sz w:val="16"/>
                 <w:szCs w:val="16"/>
               </w:rPr>
-              <w:t xml:space="preserve">BIR 2307, sales invoices and CAS books</w:t>
+              <w:t xml:space="preserve">Bank reconciliation</w:t>
             </w:r>
           </w:p>
         </w:tc>
@@ -6729,7 +6729,7 @@
                 <w:sz w:val="16"/>
                 <w:szCs w:val="16"/>
               </w:rPr>
-              <w:t xml:space="preserve">BIR Form 2307 certificates, sales invoices under the EOPT Act and the books and documents of the computerised accounting system</w:t>
+              <w:t xml:space="preserve">Bank statement upload and matching, reconciliations with approval, and the bank reconciliation reports</w:t>
             </w:r>
           </w:p>
         </w:tc>
@@ -6747,7 +6747,7 @@
                 <w:sz w:val="16"/>
                 <w:szCs w:val="16"/>
               </w:rPr>
-              <w:t xml:space="preserve">TIS-BRD-TAX-01, TIS-BRD-TAX-02, TIS-BRD-TAX-03, FGA-E3, FGA-IB-06, PBSM-M17v4-INVOICES, MOM-S5-TAX-2307-BATCH</w:t>
+              <w:t xml:space="preserve">TIS-BRD-COLL-09, TIS-BRD-RPT-OPS-12, TIS-BRD-RPT-OPS-13, PBSM-M17v4-RECON</w:t>
             </w:r>
           </w:p>
         </w:tc>
@@ -6806,7 +6806,7 @@
                 <w:sz w:val="16"/>
                 <w:szCs w:val="16"/>
               </w:rPr>
-              <w:t xml:space="preserve">Period end and financial statements</w:t>
+              <w:t xml:space="preserve">BIR 2307, sales invoices and CAS books</w:t>
             </w:r>
           </w:p>
         </w:tc>
@@ -6842,7 +6842,7 @@
                 <w:sz w:val="16"/>
                 <w:szCs w:val="16"/>
               </w:rPr>
-              <w:t xml:space="preserve">Period calendar, month-end and year-end close, close checklist and the financial statements</w:t>
+              <w:t xml:space="preserve">BIR Form 2307 certificates, sales invoices under the EOPT Act and the books and documents of the computerised accounting system</w:t>
             </w:r>
           </w:p>
         </w:tc>
@@ -6860,7 +6860,7 @@
                 <w:sz w:val="16"/>
                 <w:szCs w:val="16"/>
               </w:rPr>
-              <w:t xml:space="preserve">TIS-BRD-GL-04, TIS-BRD-RPT-04, PBSM-M32-PERIODS, PBSM-M32-CONTROLS, MOM-S4-CLOSE-26-29</w:t>
+              <w:t xml:space="preserve">TIS-BRD-TAX-01, TIS-BRD-TAX-02, TIS-BRD-TAX-03, FGA-E3, FGA-IB-06, PBSM-M17v4-INVOICES, MOM-S5-TAX-2307-BATCH</w:t>
             </w:r>
           </w:p>
         </w:tc>
@@ -6919,7 +6919,7 @@
                 <w:sz w:val="16"/>
                 <w:szCs w:val="16"/>
               </w:rPr>
-              <w:t xml:space="preserve">Incentives</w:t>
+              <w:t xml:space="preserve">Period end and financial statements</w:t>
             </w:r>
           </w:p>
         </w:tc>
@@ -6955,7 +6955,7 @@
                 <w:sz w:val="16"/>
                 <w:szCs w:val="16"/>
               </w:rPr>
-              <w:t xml:space="preserve">Telesales incentive programmes, calculation with approval, statements and reports</w:t>
+              <w:t xml:space="preserve">Period calendar, month-end and year-end close, close checklist and the financial statements</w:t>
             </w:r>
           </w:p>
         </w:tc>
@@ -6973,7 +6973,7 @@
                 <w:sz w:val="16"/>
                 <w:szCs w:val="16"/>
               </w:rPr>
-              <w:t xml:space="preserve">TIS-BRD-COMM-08</w:t>
+              <w:t xml:space="preserve">TIS-BRD-GL-04, TIS-BRD-RPT-04, PBSM-M32-PERIODS, PBSM-M32-CONTROLS, MOM-S4-CLOSE-26-29</w:t>
             </w:r>
           </w:p>
         </w:tc>
@@ -7032,7 +7032,7 @@
                 <w:sz w:val="16"/>
                 <w:szCs w:val="16"/>
               </w:rPr>
-              <w:t xml:space="preserve">Commission and referrer accounts</w:t>
+              <w:t xml:space="preserve">Incentives</w:t>
             </w:r>
           </w:p>
         </w:tc>
@@ -7050,7 +7050,7 @@
                 <w:sz w:val="16"/>
                 <w:szCs w:val="16"/>
               </w:rPr>
-              <w:t xml:space="preserve">Commission</w:t>
+              <w:t xml:space="preserve">Accounts</w:t>
             </w:r>
           </w:p>
         </w:tc>
@@ -7068,7 +7068,7 @@
                 <w:sz w:val="16"/>
                 <w:szCs w:val="16"/>
               </w:rPr>
-              <w:t xml:space="preserve">Commission dashboard, the accounts of agents, dealers and referrers with their share, the sharing schemes, the commission basis of a policy and the change requests on commission lines</w:t>
+              <w:t xml:space="preserve">Telesales incentive programmes, calculation with approval, statements and reports</w:t>
             </w:r>
           </w:p>
         </w:tc>
@@ -7086,7 +7086,7 @@
                 <w:sz w:val="16"/>
                 <w:szCs w:val="16"/>
               </w:rPr>
-              <w:t xml:space="preserve">TIS-BRD-COMM-02, TIS-BRD-COMM-05, TIS-BRD-COMM-06, TIS-BRD-PROD-16, TIS-BRD-RPT-OPS-07, FR-CMR-010, FR-CMR-015, FR-CMR-022, FR-RMT-001, FR-RMT-003, FR-RMT-005, FR-RMT-030</w:t>
+              <w:t xml:space="preserve">TIS-BRD-COMM-08</w:t>
             </w:r>
           </w:p>
         </w:tc>
@@ -7145,6 +7145,119 @@
                 <w:sz w:val="16"/>
                 <w:szCs w:val="16"/>
               </w:rPr>
+              <w:t xml:space="preserve">Commission and referrer accounts</w:t>
+            </w:r>
+          </w:p>
+        </w:tc>
+        <w:tc>
+          <w:tcPr>
+            <w:tcW w:w="1336" w:type="dxa"/>
+          </w:tcPr>
+          <w:p>
+            <w:pPr>
+              <w:spacing w:before="40" w:after="40" w:line="240" w:lineRule="auto"/>
+            </w:pPr>
+            <w:r>
+              <w:rPr>
+                <w:rFonts w:ascii="Segoe UI" w:hAnsi="Segoe UI" w:cs="Segoe UI" w:eastAsia="Segoe UI"/>
+                <w:sz w:val="16"/>
+                <w:szCs w:val="16"/>
+              </w:rPr>
+              <w:t xml:space="preserve">Commission</w:t>
+            </w:r>
+          </w:p>
+        </w:tc>
+        <w:tc>
+          <w:tcPr>
+            <w:tcW w:w="1617" w:type="dxa"/>
+          </w:tcPr>
+          <w:p>
+            <w:pPr>
+              <w:spacing w:before="40" w:after="40" w:line="240" w:lineRule="auto"/>
+            </w:pPr>
+            <w:r>
+              <w:rPr>
+                <w:rFonts w:ascii="Segoe UI" w:hAnsi="Segoe UI" w:cs="Segoe UI" w:eastAsia="Segoe UI"/>
+                <w:sz w:val="16"/>
+                <w:szCs w:val="16"/>
+              </w:rPr>
+              <w:t xml:space="preserve">Commission dashboard, the accounts of agents, dealers and referrers with their share, the sharing schemes, the commission basis of a policy and the change requests on commission lines</w:t>
+            </w:r>
+          </w:p>
+        </w:tc>
+        <w:tc>
+          <w:tcPr>
+            <w:tcW w:w="2243" w:type="dxa"/>
+          </w:tcPr>
+          <w:p>
+            <w:pPr>
+              <w:spacing w:before="40" w:after="40" w:line="240" w:lineRule="auto"/>
+            </w:pPr>
+            <w:r>
+              <w:rPr>
+                <w:rFonts w:ascii="Segoe UI" w:hAnsi="Segoe UI" w:cs="Segoe UI" w:eastAsia="Segoe UI"/>
+                <w:sz w:val="16"/>
+                <w:szCs w:val="16"/>
+              </w:rPr>
+              <w:t xml:space="preserve">TIS-BRD-COMM-02, TIS-BRD-COMM-05, TIS-BRD-COMM-06, TIS-BRD-PROD-16, TIS-BRD-RPT-OPS-07, FR-CMR-010, FR-CMR-015, FR-CMR-022, FR-RMT-001, FR-RMT-003, FR-RMT-005, FR-RMT-030</w:t>
+            </w:r>
+          </w:p>
+        </w:tc>
+        <w:tc>
+          <w:tcPr>
+            <w:tcW w:w="1156" w:type="dxa"/>
+          </w:tcPr>
+          <w:p>
+            <w:pPr>
+              <w:spacing w:before="40" w:after="40" w:line="240" w:lineRule="auto"/>
+            </w:pPr>
+            <w:r>
+              <w:rPr>
+                <w:rFonts w:ascii="Segoe UI" w:hAnsi="Segoe UI" w:cs="Segoe UI" w:eastAsia="Segoe UI"/>
+                <w:sz w:val="16"/>
+                <w:szCs w:val="16"/>
+              </w:rPr>
+              <w:t xml:space="preserve">-</w:t>
+            </w:r>
+          </w:p>
+        </w:tc>
+        <w:tc>
+          <w:tcPr>
+            <w:tcW w:w="1157" w:type="dxa"/>
+          </w:tcPr>
+          <w:p>
+            <w:pPr>
+              <w:spacing w:before="40" w:after="40" w:line="240" w:lineRule="auto"/>
+            </w:pPr>
+            <w:r>
+              <w:rPr>
+                <w:rFonts w:ascii="Segoe UI" w:hAnsi="Segoe UI" w:cs="Segoe UI" w:eastAsia="Segoe UI"/>
+                <w:sz w:val="16"/>
+                <w:szCs w:val="16"/>
+              </w:rPr>
+              <w:t xml:space="preserve">-</w:t>
+            </w:r>
+          </w:p>
+        </w:tc>
+      </w:tr>
+      <w:tr>
+        <w:trPr>
+          <w:cantSplit/>
+        </w:trPr>
+        <w:tc>
+          <w:tcPr>
+            <w:tcW w:w="1518" w:type="dxa"/>
+          </w:tcPr>
+          <w:p>
+            <w:pPr>
+              <w:spacing w:before="40" w:after="40" w:line="240" w:lineRule="auto"/>
+            </w:pPr>
+            <w:r>
+              <w:rPr>
+                <w:rFonts w:ascii="Segoe UI" w:hAnsi="Segoe UI" w:cs="Segoe UI" w:eastAsia="Segoe UI"/>
+                <w:sz w:val="16"/>
+                <w:szCs w:val="16"/>
+              </w:rPr>
               <w:t xml:space="preserve">Operational and financial reports</w:t>
             </w:r>
           </w:p>
@@ -7199,7 +7312,7 @@
                 <w:sz w:val="16"/>
                 <w:szCs w:val="16"/>
               </w:rPr>
-              <w:t xml:space="preserve">TIS-BRD-RPT-SLS-01, TIS-BRD-RPT-SLS-02, TIS-BRD-RPT-OPS-02, TIS-BRD-RPT-OPS-03, TIS-BRD-RPT-OPS-04, TIS-BRD-RPT-CCD-01, TIS-BRD-RPT-FGA-01, TIS-BRD-RPT-FGA-02, TIS-BRD-RPT-FGA-05, TIS-BRD-RPT-FGA-06</w:t>
+              <w:t xml:space="preserve">TIS-BRD-RPT-SLS-01, TIS-BRD-RPT-SLS-02, TIS-BRD-RPT-SLS-03, TIS-BRD-RPT-SLS-04, TIS-BRD-RPT-02, CR-13, TIS-BRD-RPT-OPS-02, TIS-BRD-RPT-OPS-03, TIS-BRD-RPT-OPS-04, TIS-BRD-RPT-CCD-01, TIS-BRD-RPT-FGA-01, TIS-BRD-RPT-FGA-02, TIS-BRD-RPT-FGA-05, TIS-BRD-RPT-FGA-06</w:t>
             </w:r>
           </w:p>
         </w:tc>

</xml_diff>